<commit_message>
REQ-001792: el total del R.E. de la factura suma todos los tipos de IVA y sale también en el resumen (Hagen 1.0.0.1779)
El informe estándar 1306 hace TotalECAmount := VATAmountLine."EC Amount" (asigna, no suma)
en cada línea, y con dos tipos de IVA el total de «Importe RE» de la especificación se
queda con el de un solo tipo (factura 26FV080857: 4,15 en vez de 5,01), aunque el total
de la factura sí lo incluye. La extensión suma el R.E. sobre la especificación de IVA
(TotalRE_Hagen) y el layout prueba.docx lo usa en el total. Además, el resumen de arriba
lleva una línea «Importe RE» que solo aparece si la factura tiene recargo.

Co-Authored-By: Claude Opus 5.5 <noreply@anthropic.com>
</commit_message>
<xml_diff>
--- a/src/reportextension/Layouts/prueba.docx
+++ b/src/reportextension/Layouts/prueba.docx
@@ -1385,6 +1385,238 @@
           </w:sdtContent>
         </w:sdt>
       </w:tr>
+      <w:sdt>
+        <w:sdtPr>
+          <w:rPr>
+            <w:rFonts w:ascii="Century Gothic" w:hAnsi="Century Gothic"/>
+            <w:sz w:val="16"/>
+            <w:szCs w:val="16"/>
+          </w:rPr>
+          <w:alias w:val="#Nav: /Header/ResumenRE_Hagen"/>
+          <w:tag w:val="#Nav: Standard_Sales_Invoice/1306"/>
+          <w:id w:val="700000003"/>
+          <w15:dataBinding w:prefixMappings="xmlns:ns0='urn:microsoft-dynamics-nav/reports/Standard_Sales_Invoice/1306/'" w:xpath="/ns0:NavWordReportXmlPart[1]/ns0:Header[1]/ns0:ResumenRE_Hagen" w:storeItemID="{AF7A6226-6056-400F-ADDA-E1ADA7C08250}"/>
+          <w15:repeatingSection/>
+        </w:sdtPr>
+        <w:sdtContent>
+          <w:sdt>
+            <w:sdtPr>
+              <w:rPr>
+                <w:rFonts w:ascii="Century Gothic" w:hAnsi="Century Gothic"/>
+                <w:sz w:val="16"/>
+                <w:szCs w:val="16"/>
+              </w:rPr>
+              <w:id w:val="700000004"/>
+              <w15:repeatingSectionItem/>
+            </w:sdtPr>
+            <w:sdtContent>
+              <w:tr>
+                <w:trPr>
+                  <w:trHeight w:val="113"/>
+                  <w:jc w:val="center"/>
+                </w:trPr>
+                <w:tc>
+                  <w:tcPr>
+                    <w:tcW w:w="1043" w:type="dxa"/>
+                  </w:tcPr>
+                  <w:p>
+                    <w:pPr>
+                      <w:pStyle w:val="Sinespaciado"/>
+                      <w:rPr>
+                        <w:rFonts w:ascii="Century Gothic" w:hAnsi="Century Gothic" w:cstheme="minorHAnsi"/>
+                        <w:sz w:val="14"/>
+                        <w:szCs w:val="14"/>
+                      </w:rPr>
+                    </w:pPr>
+                  </w:p>
+                </w:tc>
+                <w:tc>
+                  <w:tcPr>
+                    <w:tcW w:w="2076" w:type="dxa"/>
+                  </w:tcPr>
+                  <w:p>
+                    <w:pPr>
+                      <w:pStyle w:val="Sinespaciado"/>
+                      <w:rPr>
+                        <w:rFonts w:ascii="Century Gothic" w:hAnsi="Century Gothic" w:cstheme="minorHAnsi"/>
+                        <w:sz w:val="14"/>
+                        <w:szCs w:val="14"/>
+                      </w:rPr>
+                    </w:pPr>
+                  </w:p>
+                </w:tc>
+                <w:tc>
+                  <w:tcPr>
+                    <w:tcW w:w="709" w:type="dxa"/>
+                  </w:tcPr>
+                  <w:p>
+                    <w:pPr>
+                      <w:pStyle w:val="Sinespaciado"/>
+                      <w:rPr>
+                        <w:rFonts w:ascii="Century Gothic" w:hAnsi="Century Gothic" w:cstheme="minorHAnsi"/>
+                        <w:sz w:val="14"/>
+                        <w:szCs w:val="14"/>
+                      </w:rPr>
+                    </w:pPr>
+                  </w:p>
+                </w:tc>
+                <w:tc>
+                  <w:tcPr>
+                    <w:tcW w:w="560" w:type="dxa"/>
+                  </w:tcPr>
+                  <w:p>
+                    <w:pPr>
+                      <w:pStyle w:val="Sinespaciado"/>
+                      <w:rPr>
+                        <w:rFonts w:ascii="Century Gothic" w:hAnsi="Century Gothic" w:cstheme="minorHAnsi"/>
+                        <w:sz w:val="14"/>
+                        <w:szCs w:val="14"/>
+                      </w:rPr>
+                    </w:pPr>
+                  </w:p>
+                </w:tc>
+                <w:tc>
+                  <w:tcPr>
+                    <w:tcW w:w="567" w:type="dxa"/>
+                    <w:gridSpan w:val="2"/>
+                  </w:tcPr>
+                  <w:p>
+                    <w:pPr>
+                      <w:pStyle w:val="Sinespaciado"/>
+                      <w:rPr>
+                        <w:rFonts w:ascii="Century Gothic" w:hAnsi="Century Gothic" w:cstheme="minorHAnsi"/>
+                        <w:sz w:val="14"/>
+                        <w:szCs w:val="14"/>
+                      </w:rPr>
+                    </w:pPr>
+                  </w:p>
+                </w:tc>
+                <w:tc>
+                  <w:tcPr>
+                    <w:tcW w:w="624" w:type="dxa"/>
+                  </w:tcPr>
+                  <w:p>
+                    <w:pPr>
+                      <w:pStyle w:val="Sinespaciado"/>
+                      <w:rPr>
+                        <w:rFonts w:ascii="Century Gothic" w:hAnsi="Century Gothic" w:cstheme="minorHAnsi"/>
+                        <w:sz w:val="14"/>
+                        <w:szCs w:val="14"/>
+                      </w:rPr>
+                    </w:pPr>
+                  </w:p>
+                </w:tc>
+                <w:sdt>
+                  <w:sdtPr>
+                    <w:rPr>
+                      <w:rFonts w:ascii="Century Gothic" w:hAnsi="Century Gothic"/>
+                      <w:b/>
+                      <w:bCs/>
+                      <w:sz w:val="16"/>
+                      <w:szCs w:val="16"/>
+                    </w:rPr>
+                    <w:alias w:val="#Nav: /Header/ResumenRE_Hagen/ResumenRE_Lbl"/>
+                    <w:tag w:val="#Nav: Standard_Sales_Invoice/1306"/>
+                    <w:id w:val="700000001"/>
+                    <w:placeholder>
+                      <w:docPart w:val="0C9CDC9F0D134259B36854C4EF7C620F"/>
+                    </w:placeholder>
+                    <w:dataBinding w:prefixMappings="xmlns:ns0='urn:microsoft-dynamics-nav/reports/Standard_Sales_Invoice/1306/'" w:xpath="/ns0:NavWordReportXmlPart[1]/ns0:Header[1]/ns0:ResumenRE_Hagen[1]/ns0:ResumenRE_Lbl[1]" w:storeItemID="{AF7A6226-6056-400F-ADDA-E1ADA7C08250}"/>
+                    <w:text/>
+                  </w:sdtPr>
+                  <w:sdtContent>
+                    <w:tc>
+                      <w:tcPr>
+                        <w:tcW w:w="3777" w:type="dxa"/>
+                        <w:gridSpan w:val="6"/>
+                      </w:tcPr>
+                      <w:p>
+                        <w:pPr>
+                          <w:pStyle w:val="Sinespaciado"/>
+                          <w:jc w:val="right"/>
+                          <w:rPr>
+                            <w:rFonts w:ascii="Century Gothic" w:hAnsi="Century Gothic" w:cstheme="minorHAnsi"/>
+                            <w:b/>
+                            <w:bCs/>
+                            <w:sz w:val="16"/>
+                            <w:szCs w:val="16"/>
+                          </w:rPr>
+                        </w:pPr>
+                        <w:proofErr w:type="spellStart"/>
+                        <w:r>
+                          <w:rPr>
+                            <w:rFonts w:ascii="Century Gothic" w:hAnsi="Century Gothic"/>
+                            <w:b/>
+                            <w:bCs/>
+                            <w:sz w:val="16"/>
+                            <w:szCs w:val="16"/>
+                          </w:rPr>
+                          <w:t>ResumenRE_Lbl</w:t>
+                        </w:r>
+                        <w:proofErr w:type="spellEnd"/>
+                      </w:p>
+                    </w:tc>
+                  </w:sdtContent>
+                </w:sdt>
+                <w:sdt>
+                  <w:sdtPr>
+                    <w:rPr>
+                      <w:rFonts w:ascii="Century Gothic" w:hAnsi="Century Gothic"/>
+                      <w:b/>
+                      <w:bCs/>
+                      <w:sz w:val="16"/>
+                      <w:szCs w:val="16"/>
+                    </w:rPr>
+                    <w:alias w:val="#Nav: /Header/ResumenRE_Hagen/ResumenRE_Importe"/>
+                    <w:tag w:val="#Nav: Standard_Sales_Invoice/1306"/>
+                    <w:id w:val="700000002"/>
+                    <w:placeholder>
+                      <w:docPart w:val="70B87AF69B4E4161AEBD9DEAB610AC88"/>
+                    </w:placeholder>
+                    <w:dataBinding w:prefixMappings="xmlns:ns0='urn:microsoft-dynamics-nav/reports/Standard_Sales_Invoice/1306/'" w:xpath="/ns0:NavWordReportXmlPart[1]/ns0:Header[1]/ns0:ResumenRE_Hagen[1]/ns0:ResumenRE_Importe[1]" w:storeItemID="{AF7A6226-6056-400F-ADDA-E1ADA7C08250}"/>
+                    <w:text/>
+                  </w:sdtPr>
+                  <w:sdtContent>
+                    <w:tc>
+                      <w:tcPr>
+                        <w:tcW w:w="850" w:type="dxa"/>
+                        <w:tcMar>
+                          <w:right w:w="0" w:type="dxa"/>
+                        </w:tcMar>
+                      </w:tcPr>
+                      <w:p>
+                        <w:pPr>
+                          <w:pStyle w:val="Sinespaciado"/>
+                          <w:jc w:val="right"/>
+                          <w:rPr>
+                            <w:rFonts w:ascii="Century Gothic" w:hAnsi="Century Gothic" w:cstheme="minorHAnsi"/>
+                            <w:b/>
+                            <w:bCs/>
+                            <w:sz w:val="16"/>
+                            <w:szCs w:val="16"/>
+                          </w:rPr>
+                        </w:pPr>
+                        <w:proofErr w:type="spellStart"/>
+                        <w:r>
+                          <w:rPr>
+                            <w:rFonts w:ascii="Century Gothic" w:hAnsi="Century Gothic"/>
+                            <w:b/>
+                            <w:bCs/>
+                            <w:sz w:val="16"/>
+                            <w:szCs w:val="16"/>
+                          </w:rPr>
+                          <w:t>VATAmount_VatAmountLine</w:t>
+                        </w:r>
+                        <w:proofErr w:type="spellEnd"/>
+                      </w:p>
+                    </w:tc>
+                  </w:sdtContent>
+                </w:sdt>
+              </w:tr>
+            </w:sdtContent>
+          </w:sdt>
+        </w:sdtContent>
+      </w:sdt>
       <w:tr>
         <w:trPr>
           <w:trHeight w:val="227"/>
@@ -2545,13 +2777,13 @@
               <w:sz w:val="16"/>
               <w:szCs w:val="16"/>
             </w:rPr>
-            <w:alias w:val="#Nav: /Header/Totals/TotalECAmount"/>
+            <w:alias w:val="#Nav: /Header/Totals/TotalRE_Hagen"/>
             <w:tag w:val="#Nav: Standard_Sales_Invoice/1306"/>
             <w:id w:val="939181234"/>
             <w:placeholder>
               <w:docPart w:val="DefaultPlaceholder_-1854013440"/>
             </w:placeholder>
-            <w:dataBinding w:prefixMappings="xmlns:ns0='urn:microsoft-dynamics-nav/reports/Standard_Sales_Invoice/1306/'" w:xpath="/ns0:NavWordReportXmlPart[1]/ns0:Header[1]/ns0:Totals[1]/ns0:TotalECAmount[1]" w:storeItemID="{AF7A6226-6056-400F-ADDA-E1ADA7C08250}"/>
+            <w:dataBinding w:prefixMappings="xmlns:ns0='urn:microsoft-dynamics-nav/reports/Standard_Sales_Invoice/1306/'" w:xpath="/ns0:NavWordReportXmlPart[1]/ns0:Header[1]/ns0:Totals[1]/ns0:TotalRE_Hagen[1]" w:storeItemID="{AF7A6226-6056-400F-ADDA-E1ADA7C08250}"/>
             <w:text/>
           </w:sdtPr>
           <w:sdtContent>
@@ -2584,7 +2816,7 @@
                     <w:sz w:val="16"/>
                     <w:szCs w:val="16"/>
                   </w:rPr>
-                  <w:t>TotalECAmount</w:t>
+                  <w:t>TotalRE_Hagen</w:t>
                 </w:r>
                 <w:proofErr w:type="spellEnd"/>
               </w:p>
@@ -14496,6 +14728,8 @@
  
              < R e p o r t N a m e > R e p o r t   N a m e < / R e p o r t N a m e >   
+             < R e p o r t C a p t i o n > R e p o r t   C a p t i o n < / R e p o r t C a p t i o n > + 
              < A b o u t T h i s R e p o r t T i t l e > A b o u t   T h i s   R e p o r t   T i t l e < / A b o u t T h i s R e p o r t T i t l e >   
              < A b o u t T h i s R e p o r t T e x t > A b o u t   T h i s   R e p o r t   T e x t < / A b o u t T h i s R e p o r t T e x t > @@ -14542,6 +14776,84 @@
  
          < / R e p o r t R e q u e s t >   
+         < C o m p a n y M e t a d a t a > + 
+             < C o m p a n y N a m e > C o m p a n y   N a m e < / C o m p a n y N a m e > + 
+             < C o m p a n y D i s p l a y N a m e > C o m p a n y   D i s p l a y   N a m e < / C o m p a n y D i s p l a y N a m e > + 
+             < C o m p a n y A d d r e s s L i n e s > + 
+                 < C o m p a n y A d d r e s s L i n e 1 > C o m p a n y   A d d r e s s   L i n e   1 < / C o m p a n y A d d r e s s L i n e 1 > + 
+                 < C o m p a n y A d d r e s s L i n e 2 > C o m p a n y   A d d r e s s   L i n e   2 < / C o m p a n y A d d r e s s L i n e 2 > + 
+                 < C o m p a n y A d d r e s s L i n e 3 > C o m p a n y   A d d r e s s   L i n e   3 < / C o m p a n y A d d r e s s L i n e 3 > + 
+                 < C o m p a n y A d d r e s s L i n e 4 > C o m p a n y   A d d r e s s   L i n e   4 < / C o m p a n y A d d r e s s L i n e 4 > + 
+                 < C o m p a n y A d d r e s s L i n e 5 > C o m p a n y   A d d r e s s   L i n e   5 < / C o m p a n y A d d r e s s L i n e 5 > + 
+                 < C o m p a n y A d d r e s s L i n e 6 > C o m p a n y   A d d r e s s   L i n e   6 < / C o m p a n y A d d r e s s L i n e 6 > + 
+                 < C o m p a n y A d d r e s s L i n e 7 > C o m p a n y   A d d r e s s   L i n e   7 < / C o m p a n y A d d r e s s L i n e 7 > + 
+                 < C o m p a n y A d d r e s s L i n e 8 > C o m p a n y   A d d r e s s   L i n e   8 < / C o m p a n y A d d r e s s L i n e 8 > + 
+             < / C o m p a n y A d d r e s s L i n e s > + 
+             < C o m p a n y P h o n e > C o m p a n y   P h o n e < / C o m p a n y P h o n e > + 
+             < C o m p a n y P h o n e C a p t i o n > C o m p a n y   P h o n e   C a p t i o n < / C o m p a n y P h o n e C a p t i o n > + 
+             < C o m p a n y F a x N o > C o m p a n y   F a x   N o . < / C o m p a n y F a x N o > + 
+             < C o m p a n y F a x N o C a p t i o n > C o m p a n y   F a x   N o .   C a p t i o n < / C o m p a n y F a x N o C a p t i o n > + 
+             < C o m p a n y E m a i l > C o m p a n y   E m a i l < / C o m p a n y E m a i l > + 
+             < C o m p a n y E m a i l C a p t i o n > C o m p a n y   E m a i l   C a p t i o n < / C o m p a n y E m a i l C a p t i o n > + 
+             < C o m p a n y H o m e P a g e > C o m p a n y   H o m e   P a g e < / C o m p a n y H o m e P a g e > + 
+             < C o m p a n y H o m e P a g e C a p t i o n > C o m p a n y   H o m e   P a g e   C a p t i o n < / C o m p a n y H o m e P a g e C a p t i o n > + 
+             < C o m p a n y L o g o > C o m p a n y   L o g o < / C o m p a n y L o g o > + 
+             < C o m p a n y V A T R e g i s t r a t i o n N o > C o m p a n y   V A T   R e g i s t r a t i o n   N o . < / C o m p a n y V A T R e g i s t r a t i o n N o > + 
+             < C o m p a n y V A T R e g i s t r a t i o n N o C a p t i o n > C o m p a n y   V A T   R e g i s t r a t i o n   N o .   C a p t i o n < / C o m p a n y V A T R e g i s t r a t i o n N o C a p t i o n > + 
+             < C o m p a n y R e g i s t r a t i o n N o > C o m p a n y   R e g i s t r a t i o n   N o . < / C o m p a n y R e g i s t r a t i o n N o > + 
+             < C o m p a n y R e g i s t r a t i o n N o C a p t i o n > C o m p a n y   R e g i s t r a t i o n   N o .   C a p t i o n < / C o m p a n y R e g i s t r a t i o n N o C a p t i o n > + 
+             < C o m p a n y B a n k N a m e > C o m p a n y   B a n k   N a m e < / C o m p a n y B a n k N a m e > + 
+             < C o m p a n y B a n k N a m e C a p t i o n > C o m p a n y   B a n k   N a m e   C a p t i o n < / C o m p a n y B a n k N a m e C a p t i o n > + 
+             < C o m p a n y B a n k A c c o u n t N o > C o m p a n y   B a n k   A c c o u n t   N o . < / C o m p a n y B a n k A c c o u n t N o > + 
+             < C o m p a n y B a n k A c c o u n t N o C a p t i o n > C o m p a n y   B a n k   A c c o u n t   N o .   C a p t i o n < / C o m p a n y B a n k A c c o u n t N o C a p t i o n > + 
+             < C o m p a n y B a n k B r a n c h N o > C o m p a n y   B a n k   B r a n c h   N o . < / C o m p a n y B a n k B r a n c h N o > + 
+             < C o m p a n y B a n k B r a n c h N o C a p t i o n > C o m p a n y   B a n k   B r a n c h   N o .   C a p t i o n < / C o m p a n y B a n k B r a n c h N o C a p t i o n > + 
+             < C o m p a n y I B A N > C o m p a n y   I B A N < / C o m p a n y I B A N > + 
+             < C o m p a n y I B A N C a p t i o n > C o m p a n y   I B A N   C a p t i o n < / C o m p a n y I B A N C a p t i o n > + 
+             < C o m p a n y B a n k S W I F T > C o m p a n y   B a n k   S W I F T < / C o m p a n y B a n k S W I F T > + 
+             < C o m p a n y B a n k S W I F T C a p t i o n > C o m p a n y   B a n k   S W I F T   C a p t i o n < / C o m p a n y B a n k S W I F T C a p t i o n > + 
+             < C o m p a n y G i r o N o > C o m p a n y   G i r o   N o . < / C o m p a n y G i r o N o > + 
+             < C o m p a n y G i r o N o C a p t i o n > C o m p a n y   G i r o   N o .   C a p t i o n < / C o m p a n y G i r o N o C a p t i o n > + 
+         < / C o m p a n y M e t a d a t a > + 
      < / B C R e p o r t I n f o r m a t i o n >   
      < H e a d e r > @@ -15128,6 +15440,8 @@
  
              < T o t a l P a y m e n t D i s c o u n t O n V A T > T o t a l P a y m e n t D i s c o u n t O n V A T < / T o t a l P a y m e n t D i s c o u n t O n V A T >   
+             < T o t a l R E _ H a g e n > T o t a l R E _ H a g e n < / T o t a l R E _ H a g e n > + 
              < T o t a l S u b T o t a l > T o t a l S u b T o t a l < / T o t a l S u b T o t a l >   
              < T o t a l S u b T o t a l M i n u s I n v o i c e D i s c o u n t > T o t a l S u b T o t a l M i n u s I n v o i c e D i s c o u n t < / T o t a l S u b T o t a l M i n u s I n v o i c e D i s c o u n t > @@ -15149,6 +15463,14 @@
              < T o t a l V a t M i n u s E C A m o u n t > T o t a l V a t M i n u s E C A m o u n t < / T o t a l V a t M i n u s E C A m o u n t >   
          < / T o t a l s > + 
+         < R e s u m e n R E _ H a g e n > + 
+             < R e s u m e n R E _ I m p o r t e > R e s u m e n R E _ I m p o r t e < / R e s u m e n R E _ I m p o r t e > + 
+             < R e s u m e n R E _ L b l > R e s u m e n R E _ L b l < / R e s u m e n R E _ L b l > + 
+         < / R e s u m e n R E _ H a g e n >   
      < / H e a d e r >   
@@ -15175,6 +15497,8 @@
  
              < R e p o r t N a m e > R e p o r t   N a m e < / R e p o r t N a m e >   
+             < R e p o r t C a p t i o n > R e p o r t   C a p t i o n < / R e p o r t C a p t i o n > + 
              < A b o u t T h i s R e p o r t T i t l e > A b o u t   T h i s   R e p o r t   T i t l e < / A b o u t T h i s R e p o r t T i t l e >   
              < A b o u t T h i s R e p o r t T e x t > A b o u t   T h i s   R e p o r t   T e x t < / A b o u t T h i s R e p o r t T e x t > @@ -15221,6 +15545,84 @@
  
          < / R e p o r t R e q u e s t >   
+         < C o m p a n y M e t a d a t a > + 
+             < C o m p a n y N a m e > C o m p a n y   N a m e < / C o m p a n y N a m e > + 
+             < C o m p a n y D i s p l a y N a m e > C o m p a n y   D i s p l a y   N a m e < / C o m p a n y D i s p l a y N a m e > + 
+             < C o m p a n y A d d r e s s L i n e s > + 
+                 < C o m p a n y A d d r e s s L i n e 1 > C o m p a n y   A d d r e s s   L i n e   1 < / C o m p a n y A d d r e s s L i n e 1 > + 
+                 < C o m p a n y A d d r e s s L i n e 2 > C o m p a n y   A d d r e s s   L i n e   2 < / C o m p a n y A d d r e s s L i n e 2 > + 
+                 < C o m p a n y A d d r e s s L i n e 3 > C o m p a n y   A d d r e s s   L i n e   3 < / C o m p a n y A d d r e s s L i n e 3 > + 
+                 < C o m p a n y A d d r e s s L i n e 4 > C o m p a n y   A d d r e s s   L i n e   4 < / C o m p a n y A d d r e s s L i n e 4 > + 
+                 < C o m p a n y A d d r e s s L i n e 5 > C o m p a n y   A d d r e s s   L i n e   5 < / C o m p a n y A d d r e s s L i n e 5 > + 
+                 < C o m p a n y A d d r e s s L i n e 6 > C o m p a n y   A d d r e s s   L i n e   6 < / C o m p a n y A d d r e s s L i n e 6 > + 
+                 < C o m p a n y A d d r e s s L i n e 7 > C o m p a n y   A d d r e s s   L i n e   7 < / C o m p a n y A d d r e s s L i n e 7 > + 
+                 < C o m p a n y A d d r e s s L i n e 8 > C o m p a n y   A d d r e s s   L i n e   8 < / C o m p a n y A d d r e s s L i n e 8 > + 
+             < / C o m p a n y A d d r e s s L i n e s > + 
+             < C o m p a n y P h o n e > C o m p a n y   P h o n e < / C o m p a n y P h o n e > + 
+             < C o m p a n y P h o n e C a p t i o n > C o m p a n y   P h o n e   C a p t i o n < / C o m p a n y P h o n e C a p t i o n > + 
+             < C o m p a n y F a x N o > C o m p a n y   F a x   N o . < / C o m p a n y F a x N o > + 
+             < C o m p a n y F a x N o C a p t i o n > C o m p a n y   F a x   N o .   C a p t i o n < / C o m p a n y F a x N o C a p t i o n > + 
+             < C o m p a n y E m a i l > C o m p a n y   E m a i l < / C o m p a n y E m a i l > + 
+             < C o m p a n y E m a i l C a p t i o n > C o m p a n y   E m a i l   C a p t i o n < / C o m p a n y E m a i l C a p t i o n > + 
+             < C o m p a n y H o m e P a g e > C o m p a n y   H o m e   P a g e < / C o m p a n y H o m e P a g e > + 
+             < C o m p a n y H o m e P a g e C a p t i o n > C o m p a n y   H o m e   P a g e   C a p t i o n < / C o m p a n y H o m e P a g e C a p t i o n > + 
+             < C o m p a n y L o g o > C o m p a n y   L o g o < / C o m p a n y L o g o > + 
+             < C o m p a n y V A T R e g i s t r a t i o n N o > C o m p a n y   V A T   R e g i s t r a t i o n   N o . < / C o m p a n y V A T R e g i s t r a t i o n N o > + 
+             < C o m p a n y V A T R e g i s t r a t i o n N o C a p t i o n > C o m p a n y   V A T   R e g i s t r a t i o n   N o .   C a p t i o n < / C o m p a n y V A T R e g i s t r a t i o n N o C a p t i o n > + 
+             < C o m p a n y R e g i s t r a t i o n N o > C o m p a n y   R e g i s t r a t i o n   N o . < / C o m p a n y R e g i s t r a t i o n N o > + 
+             < C o m p a n y R e g i s t r a t i o n N o C a p t i o n > C o m p a n y   R e g i s t r a t i o n   N o .   C a p t i o n < / C o m p a n y R e g i s t r a t i o n N o C a p t i o n > + 
+             < C o m p a n y B a n k N a m e > C o m p a n y   B a n k   N a m e < / C o m p a n y B a n k N a m e > + 
+             < C o m p a n y B a n k N a m e C a p t i o n > C o m p a n y   B a n k   N a m e   C a p t i o n < / C o m p a n y B a n k N a m e C a p t i o n > + 
+             < C o m p a n y B a n k A c c o u n t N o > C o m p a n y   B a n k   A c c o u n t   N o . < / C o m p a n y B a n k A c c o u n t N o > + 
+             < C o m p a n y B a n k A c c o u n t N o C a p t i o n > C o m p a n y   B a n k   A c c o u n t   N o .   C a p t i o n < / C o m p a n y B a n k A c c o u n t N o C a p t i o n > + 
+             < C o m p a n y B a n k B r a n c h N o > C o m p a n y   B a n k   B r a n c h   N o . < / C o m p a n y B a n k B r a n c h N o > + 
+             < C o m p a n y B a n k B r a n c h N o C a p t i o n > C o m p a n y   B a n k   B r a n c h   N o .   C a p t i o n < / C o m p a n y B a n k B r a n c h N o C a p t i o n > + 
+             < C o m p a n y I B A N > C o m p a n y   I B A N < / C o m p a n y I B A N > + 
+             < C o m p a n y I B A N C a p t i o n > C o m p a n y   I B A N   C a p t i o n < / C o m p a n y I B A N C a p t i o n > + 
+             < C o m p a n y B a n k S W I F T > C o m p a n y   B a n k   S W I F T < / C o m p a n y B a n k S W I F T > + 
+             < C o m p a n y B a n k S W I F T C a p t i o n > C o m p a n y   B a n k   S W I F T   C a p t i o n < / C o m p a n y B a n k S W I F T C a p t i o n > + 
+             < C o m p a n y G i r o N o > C o m p a n y   G i r o   N o . < / C o m p a n y G i r o N o > + 
+             < C o m p a n y G i r o N o C a p t i o n > C o m p a n y   G i r o   N o .   C a p t i o n < / C o m p a n y G i r o N o C a p t i o n > + 
+         < / C o m p a n y M e t a d a t a > + 
      < / B C R e p o r t I n f o r m a t i o n >   
      < T o o l t i p s   / > @@ -15809,6 +16211,8 @@
  
              < T o t a l P a y m e n t D i s c o u n t O n V A T   E l e m e n t T y p e = " C o l u m n "   E l e m e n t I d = " 7 3 6 0 4 1 8 8 6 "   D a t a T y p e = " D e c i m a l " > T o t a l P a y m e n t D i s c o u n t O n V A T < / T o t a l P a y m e n t D i s c o u n t O n V A T >   
+             < T o t a l R E _ H a g e n   E l e m e n t T y p e = " C o l u m n "   E l e m e n t I d = " 7 0 6 3 0 5 4 2 "   D a t a T y p e = " D e c i m a l " > T o t a l R E _ H a g e n < / T o t a l R E _ H a g e n > + 
              < T o t a l S u b T o t a l   E l e m e n t T y p e = " C o l u m n "   E l e m e n t I d = " 2 0 9 7 8 7 6 8 0 1 "   D a t a T y p e = " S t r i n g " > T o t a l S u b T o t a l < / T o t a l S u b T o t a l >   
              < T o t a l S u b T o t a l M i n u s I n v o i c e D i s c o u n t   E l e m e n t T y p e = " C o l u m n "   E l e m e n t I d = " 7 6 9 4 3 1 8 8 7 "   D a t a T y p e = " S t r i n g " > T o t a l S u b T o t a l M i n u s I n v o i c e D i s c o u n t < / T o t a l S u b T o t a l M i n u s I n v o i c e D i s c o u n t > @@ -15830,6 +16234,14 @@
              < T o t a l V a t M i n u s E C A m o u n t   E l e m e n t T y p e = " C o l u m n "   E l e m e n t I d = " 1 2 0 9 6 0 5 5 0 "   D a t a T y p e = " D e c i m a l " > T o t a l V a t M i n u s E C A m o u n t < / T o t a l V a t M i n u s E C A m o u n t >   
          < / T o t a l s > + 
+         < R e s u m e n R E _ H a g e n   E l e m e n t T y p e = " D a t a I t e m "   E l e m e n t I d = " 4 9 2 3 3 7 2 0 7 " > + 
+             < R e s u m e n R E _ I m p o r t e   E l e m e n t T y p e = " C o l u m n "   E l e m e n t I d = " 1 5 8 3 8 5 7 2 9 8 "   D a t a T y p e = " D e c i m a l " > R e s u m e n R E _ I m p o r t e < / R e s u m e n R E _ I m p o r t e > + 
+             < R e s u m e n R E _ L b l   E l e m e n t T y p e = " C o l u m n "   E l e m e n t I d = " 2 0 6 7 5 4 0 8 2 4 "   D a t a T y p e = " L a b e l " > R e s u m e n R E _ L b l < / R e s u m e n R E _ L b l > + 
+         < / R e s u m e n R E _ H a g e n >   
      < / H e a d e r >   

</xml_diff>